<commit_message>
Mark Zheng et al. Cities paper as corresponding author and update counts
Co-Authored-By: Claude Fable 5.1 <noreply@anthropic.com>
Claude-Session: https://claude.ai/code/session_011Fb3J2jT9D3t8E1YWF5hnF
</commit_message>
<xml_diff>
--- a/cv/Sunbin_Yoo_Achievements_2026_3.docx
+++ b/cv/Sunbin_Yoo_Achievements_2026_3.docx
@@ -422,7 +422,7 @@
                 <w:sz w:val="18"/>
                 <w:szCs w:val="18"/>
               </w:rPr>
-              <w:t>3</w:t>
+              <w:t>4</w:t>
             </w:r>
           </w:p>
         </w:tc>
@@ -550,7 +550,7 @@
                 <w:sz w:val="18"/>
                 <w:szCs w:val="18"/>
               </w:rPr>
-              <w:t>6</w:t>
+              <w:t>5</w:t>
             </w:r>
           </w:p>
         </w:tc>
@@ -4740,7 +4740,7 @@
           <w:sz w:val="16"/>
           <w:szCs w:val="16"/>
         </w:rPr>
-        <w:t xml:space="preserve">Co-author  ·  IF 6.6  ·  JCR top 11.4%</w:t>
+        <w:t xml:space="preserve">Corresponding author  ·  IF 6.6  ·  JCR top 11.4%</w:t>
       </w:r>
     </w:p>
     <w:p>

</xml_diff>

<commit_message>
Add three Transportation Research Part A submissions to under-review list
Co-Authored-By: Claude Fable 5.1 <noreply@anthropic.com>
Claude-Session: https://claude.ai/code/session_011Fb3J2jT9D3t8E1YWF5hnF
</commit_message>
<xml_diff>
--- a/cv/Sunbin_Yoo_Achievements_2026_3.docx
+++ b/cv/Sunbin_Yoo_Achievements_2026_3.docx
@@ -615,7 +615,7 @@
                 <w:sz w:val="18"/>
                 <w:szCs w:val="18"/>
               </w:rPr>
-              <w:t>10</w:t>
+              <w:t>12</w:t>
             </w:r>
           </w:p>
         </w:tc>
@@ -7019,7 +7019,7 @@
           <w:sz w:val="20"/>
           <w:szCs w:val="20"/>
         </w:rPr>
-        <w:t>Under Review (4)</w:t>
+        <w:t>Under Review (7)</w:t>
       </w:r>
     </w:p>
     <w:p>
@@ -7039,7 +7039,7 @@
         <w:rPr>
           <w:rFonts w:eastAsia="Arial"/>
         </w:rPr>
-        <w:t xml:space="preserve">"Micromobility after midnight: How e-scooters fill the gap when trains stop" </w:t>
+        <w:t xml:space="preserve">"Global air connectivity and trade openness, 1996–2024" </w:t>
       </w:r>
       <w:r>
         <w:rPr>
@@ -7048,7 +7048,7 @@
           <w:sz w:val="17"/>
           <w:szCs w:val="17"/>
         </w:rPr>
-        <w:t>with J. Kumagai, Y. Noritake, Y. Imoto, E. Lee — Journal of Transport Geography</w:t>
+        <w:t xml:space="preserve">with J. Lee, J. Kumagai, C. Wang, T. K.-Y. Cheung, L. Zheng — Transportation Research Part A</w:t>
       </w:r>
     </w:p>
     <w:p>
@@ -7068,7 +7068,7 @@
         <w:rPr>
           <w:rFonts w:eastAsia="Arial"/>
         </w:rPr>
-        <w:t xml:space="preserve">"Do e-scooter speed governance policies reduce harsh acceleration and deceleration? Evidence from 19.5 million trips around a regulatory ban" </w:t>
+        <w:t xml:space="preserve">"What expressways remove: Market access and the industrial composition of Japanese manufacturing in a shrinking economy" </w:t>
       </w:r>
       <w:r>
         <w:rPr>
@@ -7077,7 +7077,7 @@
           <w:sz w:val="17"/>
           <w:szCs w:val="17"/>
         </w:rPr>
-        <w:t>with S. Choi, S. Lee — Transportation Research Part F</w:t>
+        <w:t xml:space="preserve">with D. Kim, J. Kumagai, L. Zheng — Transportation Research Part A (corresponding author)</w:t>
       </w:r>
     </w:p>
     <w:p>
@@ -7097,7 +7097,7 @@
         <w:rPr>
           <w:rFonts w:eastAsia="Arial"/>
         </w:rPr>
-        <w:t xml:space="preserve">"What drives freight drone demand over trucks? Disentangling acceptance channels with a simultaneous ICLV model" </w:t>
+        <w:t xml:space="preserve">"Railway accessibility improves women's employment opportunities: Evidence from Tokyo, 2000–2020" </w:t>
       </w:r>
       <w:r>
         <w:rPr>
@@ -7106,7 +7106,7 @@
           <w:sz w:val="17"/>
           <w:szCs w:val="17"/>
         </w:rPr>
-        <w:t>with J. Kumagai, L. Zheng, J. Ha, S. Lee — Transportation Research Part A</w:t>
+        <w:t xml:space="preserve">with L. Zheng, J. Kumagai, E. Lee, M. Kawabata — Transportation Research Part A</w:t>
       </w:r>
     </w:p>
     <w:p>
@@ -7126,7 +7126,7 @@
         <w:rPr>
           <w:rFonts w:eastAsia="Arial"/>
         </w:rPr>
-        <w:t xml:space="preserve">"Can on-demand buses save aging communities? Technology adoption, social inclusion, and the digital divide in Japan's super-aged society" </w:t>
+        <w:t xml:space="preserve">"Micromobility after midnight: How e-scooters fill the gap when trains stop" </w:t>
       </w:r>
       <w:r>
         <w:rPr>
@@ -7135,6 +7135,93 @@
           <w:sz w:val="17"/>
           <w:szCs w:val="17"/>
         </w:rPr>
+        <w:t>with J. Kumagai, Y. Noritake, Y. Imoto, E. Lee — Journal of Transport Geography</w:t>
+      </w:r>
+    </w:p>
+    <w:p>
+      <w:pPr>
+        <w:spacing w:after="70" w:line="250" w:lineRule="auto"/>
+        <w:ind w:left="340" w:hanging="340"/>
+      </w:pPr>
+      <w:r>
+        <w:rPr>
+          <w:rFonts w:eastAsia="Arial"/>
+          <w:b/>
+          <w:bCs/>
+        </w:rPr>
+        <w:t xml:space="preserve">• </w:t>
+      </w:r>
+      <w:r>
+        <w:rPr>
+          <w:rFonts w:eastAsia="Arial"/>
+        </w:rPr>
+        <w:t xml:space="preserve">"Do e-scooter speed governance policies reduce harsh acceleration and deceleration? Evidence from 19.5 million trips around a regulatory ban" </w:t>
+      </w:r>
+      <w:r>
+        <w:rPr>
+          <w:rFonts w:eastAsia="Arial"/>
+          <w:color w:val="595959"/>
+          <w:sz w:val="17"/>
+          <w:szCs w:val="17"/>
+        </w:rPr>
+        <w:t>with S. Choi, S. Lee — Transportation Research Part F</w:t>
+      </w:r>
+    </w:p>
+    <w:p>
+      <w:pPr>
+        <w:spacing w:after="70" w:line="250" w:lineRule="auto"/>
+        <w:ind w:left="340" w:hanging="340"/>
+      </w:pPr>
+      <w:r>
+        <w:rPr>
+          <w:rFonts w:eastAsia="Arial"/>
+          <w:b/>
+          <w:bCs/>
+        </w:rPr>
+        <w:t xml:space="preserve">• </w:t>
+      </w:r>
+      <w:r>
+        <w:rPr>
+          <w:rFonts w:eastAsia="Arial"/>
+        </w:rPr>
+        <w:t xml:space="preserve">"What drives freight drone demand over trucks? Disentangling acceptance channels with a simultaneous ICLV model" </w:t>
+      </w:r>
+      <w:r>
+        <w:rPr>
+          <w:rFonts w:eastAsia="Arial"/>
+          <w:color w:val="595959"/>
+          <w:sz w:val="17"/>
+          <w:szCs w:val="17"/>
+        </w:rPr>
+        <w:t>with J. Kumagai, L. Zheng, J. Ha, S. Lee — Transportation Research Part A</w:t>
+      </w:r>
+    </w:p>
+    <w:p>
+      <w:pPr>
+        <w:spacing w:after="70" w:line="250" w:lineRule="auto"/>
+        <w:ind w:left="340" w:hanging="340"/>
+      </w:pPr>
+      <w:r>
+        <w:rPr>
+          <w:rFonts w:eastAsia="Arial"/>
+          <w:b/>
+          <w:bCs/>
+        </w:rPr>
+        <w:t xml:space="preserve">• </w:t>
+      </w:r>
+      <w:r>
+        <w:rPr>
+          <w:rFonts w:eastAsia="Arial"/>
+        </w:rPr>
+        <w:t xml:space="preserve">"Can on-demand buses save aging communities? Technology adoption, social inclusion, and the digital divide in Japan's super-aged society" </w:t>
+      </w:r>
+      <w:r>
+        <w:rPr>
+          <w:rFonts w:eastAsia="Arial"/>
+          <w:color w:val="595959"/>
+          <w:sz w:val="17"/>
+          <w:szCs w:val="17"/>
+        </w:rPr>
         <w:t>with J. Zheng — Technology in Society</w:t>
       </w:r>
     </w:p>
@@ -7152,27 +7239,7 @@
           <w:sz w:val="20"/>
           <w:szCs w:val="20"/>
         </w:rPr>
-        <w:t>In Progress (3)</w:t>
-      </w:r>
-    </w:p>
-    <w:p>
-      <w:pPr>
-        <w:spacing w:after="70" w:line="250" w:lineRule="auto"/>
-        <w:ind w:left="340" w:hanging="340"/>
-      </w:pPr>
-      <w:r>
-        <w:rPr>
-          <w:rFonts w:eastAsia="Arial"/>
-          <w:b/>
-          <w:bCs/>
-        </w:rPr>
-        <w:t xml:space="preserve">• </w:t>
-      </w:r>
-      <w:r>
-        <w:rPr>
-          <w:rFonts w:eastAsia="Arial"/>
-        </w:rPr>
-        <w:t xml:space="preserve">"Global air connectivity and trade openness" </w:t>
+        <w:t>In Progress (2)</w:t>
       </w:r>
     </w:p>
     <w:p>

</xml_diff>

<commit_message>
Add Transportation Research Part E to referee service
Co-Authored-By: Claude Fable 5.1 <noreply@anthropic.com>
Claude-Session: https://claude.ai/code/session_011Fb3J2jT9D3t8E1YWF5hnF
</commit_message>
<xml_diff>
--- a/cv/Sunbin_Yoo_Achievements_2026_3.docx
+++ b/cv/Sunbin_Yoo_Achievements_2026_3.docx
@@ -1255,7 +1255,7 @@
                 <w:sz w:val="18"/>
                 <w:szCs w:val="18"/>
               </w:rPr>
-              <w:t>10</w:t>
+              <w:t>11</w:t>
             </w:r>
           </w:p>
         </w:tc>
@@ -8170,6 +8170,69 @@
                 <w:szCs w:val="18"/>
               </w:rPr>
               <w:t>Serving since</w:t>
+            </w:r>
+          </w:p>
+        </w:tc>
+      </w:tr>
+      <w:tr>
+        <w:tc>
+          <w:tcPr>
+            <w:tcW w:w="7000" w:type="dxa"/>
+            <w:tcBorders>
+              <w:top w:val="single" w:sz="2" w:space="0" w:color="BFBFBF"/>
+              <w:left w:val="single" w:sz="2" w:space="0" w:color="BFBFBF"/>
+              <w:bottom w:val="single" w:sz="2" w:space="0" w:color="BFBFBF"/>
+              <w:right w:val="single" w:sz="2" w:space="0" w:color="BFBFBF"/>
+            </w:tcBorders>
+            <w:tcMar>
+              <w:top w:w="60" w:type="dxa"/>
+              <w:left w:w="110" w:type="dxa"/>
+              <w:bottom w:w="60" w:type="dxa"/>
+              <w:right w:w="110" w:type="dxa"/>
+            </w:tcMar>
+          </w:tcPr>
+          <w:p>
+            <w:pPr>
+              <w:spacing w:line="230" w:lineRule="auto"/>
+            </w:pPr>
+            <w:r>
+              <w:rPr>
+                <w:rFonts w:eastAsia="Arial"/>
+                <w:sz w:val="18"/>
+                <w:szCs w:val="18"/>
+              </w:rPr>
+              <w:t>Transportation Research Part E: Logistics and Transportation Review</w:t>
+            </w:r>
+          </w:p>
+        </w:tc>
+        <w:tc>
+          <w:tcPr>
+            <w:tcW w:w="2746" w:type="dxa"/>
+            <w:tcBorders>
+              <w:top w:val="single" w:sz="2" w:space="0" w:color="BFBFBF"/>
+              <w:left w:val="single" w:sz="2" w:space="0" w:color="BFBFBF"/>
+              <w:bottom w:val="single" w:sz="2" w:space="0" w:color="BFBFBF"/>
+              <w:right w:val="single" w:sz="2" w:space="0" w:color="BFBFBF"/>
+            </w:tcBorders>
+            <w:tcMar>
+              <w:top w:w="60" w:type="dxa"/>
+              <w:left w:w="110" w:type="dxa"/>
+              <w:bottom w:w="60" w:type="dxa"/>
+              <w:right w:w="110" w:type="dxa"/>
+            </w:tcMar>
+          </w:tcPr>
+          <w:p>
+            <w:pPr>
+              <w:spacing w:line="230" w:lineRule="auto"/>
+              <w:jc w:val="center"/>
+            </w:pPr>
+            <w:r>
+              <w:rPr>
+                <w:rFonts w:eastAsia="Arial"/>
+                <w:sz w:val="18"/>
+                <w:szCs w:val="18"/>
+              </w:rPr>
+              <w:t>2026</w:t>
             </w:r>
           </w:p>
         </w:tc>

</xml_diff>

<commit_message>
Update teaching table: extend Urban Planning and add new course
Co-Authored-By: Claude Fable 5.1 <noreply@anthropic.com>
Claude-Session: https://claude.ai/code/session_011Fb3J2jT9D3t8E1YWF5hnF
</commit_message>
<xml_diff>
--- a/cv/Sunbin_Yoo_Achievements_2026_3.docx
+++ b/cv/Sunbin_Yoo_Achievements_2026_3.docx
@@ -9154,7 +9154,7 @@
                 <w:sz w:val="18"/>
                 <w:szCs w:val="18"/>
               </w:rPr>
-              <w:t>2020–2024</w:t>
+              <w:t>2020–2026</w:t>
             </w:r>
           </w:p>
         </w:tc>
@@ -9186,6 +9186,131 @@
                 <w:szCs w:val="18"/>
               </w:rPr>
               <w:t>Japanese</w:t>
+            </w:r>
+          </w:p>
+        </w:tc>
+      </w:tr>
+      <w:tr>
+        <w:tc>
+          <w:tcPr>
+            <w:tcW w:w="3900" w:type="dxa"/>
+            <w:tcBorders>
+              <w:top w:val="single" w:sz="2" w:space="0" w:color="BFBFBF"/>
+              <w:left w:val="single" w:sz="2" w:space="0" w:color="BFBFBF"/>
+              <w:bottom w:val="single" w:sz="2" w:space="0" w:color="BFBFBF"/>
+              <w:right w:val="single" w:sz="2" w:space="0" w:color="BFBFBF"/>
+            </w:tcBorders>
+            <w:tcMar>
+              <w:top w:w="60" w:type="dxa"/>
+              <w:left w:w="110" w:type="dxa"/>
+              <w:bottom w:w="60" w:type="dxa"/>
+              <w:right w:w="110" w:type="dxa"/>
+            </w:tcMar>
+          </w:tcPr>
+          <w:p>
+            <w:pPr>
+              <w:spacing w:line="230" w:lineRule="auto"/>
+            </w:pPr>
+            <w:r>
+              <w:rPr>
+                <w:rFonts w:eastAsia="Arial"/>
+                <w:sz w:val="18"/>
+                <w:szCs w:val="18"/>
+              </w:rPr>
+              <w:t>Civil and Architecture Engineering</w:t>
+            </w:r>
+          </w:p>
+        </w:tc>
+        <w:tc>
+          <w:tcPr>
+            <w:tcW w:w="2900" w:type="dxa"/>
+            <w:tcBorders>
+              <w:top w:val="single" w:sz="2" w:space="0" w:color="BFBFBF"/>
+              <w:left w:val="single" w:sz="2" w:space="0" w:color="BFBFBF"/>
+              <w:bottom w:val="single" w:sz="2" w:space="0" w:color="BFBFBF"/>
+              <w:right w:val="single" w:sz="2" w:space="0" w:color="BFBFBF"/>
+            </w:tcBorders>
+            <w:tcMar>
+              <w:top w:w="60" w:type="dxa"/>
+              <w:left w:w="110" w:type="dxa"/>
+              <w:bottom w:w="60" w:type="dxa"/>
+              <w:right w:w="110" w:type="dxa"/>
+            </w:tcMar>
+          </w:tcPr>
+          <w:p>
+            <w:pPr>
+              <w:spacing w:line="230" w:lineRule="auto"/>
+              <w:jc w:val="center"/>
+            </w:pPr>
+            <w:r>
+              <w:rPr>
+                <w:rFonts w:eastAsia="Arial"/>
+                <w:sz w:val="18"/>
+                <w:szCs w:val="18"/>
+              </w:rPr>
+              <w:t>Kyushu University</w:t>
+            </w:r>
+          </w:p>
+        </w:tc>
+        <w:tc>
+          <w:tcPr>
+            <w:tcW w:w="1300" w:type="dxa"/>
+            <w:tcBorders>
+              <w:top w:val="single" w:sz="2" w:space="0" w:color="BFBFBF"/>
+              <w:left w:val="single" w:sz="2" w:space="0" w:color="BFBFBF"/>
+              <w:bottom w:val="single" w:sz="2" w:space="0" w:color="BFBFBF"/>
+              <w:right w:val="single" w:sz="2" w:space="0" w:color="BFBFBF"/>
+            </w:tcBorders>
+            <w:tcMar>
+              <w:top w:w="60" w:type="dxa"/>
+              <w:left w:w="110" w:type="dxa"/>
+              <w:bottom w:w="60" w:type="dxa"/>
+              <w:right w:w="110" w:type="dxa"/>
+            </w:tcMar>
+          </w:tcPr>
+          <w:p>
+            <w:pPr>
+              <w:spacing w:line="230" w:lineRule="auto"/>
+              <w:jc w:val="center"/>
+            </w:pPr>
+            <w:r>
+              <w:rPr>
+                <w:rFonts w:eastAsia="Arial"/>
+                <w:sz w:val="18"/>
+                <w:szCs w:val="18"/>
+              </w:rPr>
+              <w:t>2024–2026</w:t>
+            </w:r>
+          </w:p>
+        </w:tc>
+        <w:tc>
+          <w:tcPr>
+            <w:tcW w:w="1646" w:type="dxa"/>
+            <w:tcBorders>
+              <w:top w:val="single" w:sz="2" w:space="0" w:color="BFBFBF"/>
+              <w:left w:val="single" w:sz="2" w:space="0" w:color="BFBFBF"/>
+              <w:bottom w:val="single" w:sz="2" w:space="0" w:color="BFBFBF"/>
+              <w:right w:val="single" w:sz="2" w:space="0" w:color="BFBFBF"/>
+            </w:tcBorders>
+            <w:tcMar>
+              <w:top w:w="60" w:type="dxa"/>
+              <w:left w:w="110" w:type="dxa"/>
+              <w:bottom w:w="60" w:type="dxa"/>
+              <w:right w:w="110" w:type="dxa"/>
+            </w:tcMar>
+          </w:tcPr>
+          <w:p>
+            <w:pPr>
+              <w:spacing w:line="230" w:lineRule="auto"/>
+              <w:jc w:val="center"/>
+            </w:pPr>
+            <w:r>
+              <w:rPr>
+                <w:rFonts w:eastAsia="Arial"/>
+                <w:sz w:val="18"/>
+                <w:szCs w:val="18"/>
+              </w:rPr>
+              <w:t>English</w:t>
             </w:r>
           </w:p>
         </w:tc>

</xml_diff>